<commit_message>
feat(piloto): cuentas estudiantes, datos demo e instrumento OE4
- seed_students.py: 49 cuentas reales desde padrones ATI-V-M/N (modo xlsx y --from-csv)
- seed_demo_activity.py: actividad demo (progreso/quiz/logros/chat) para poblar dashboards; NO es evidencia OE4
- instrumento-pretest-postest-OE4 (20 items M1-M5) + notebook analisis (t pareada/d Cohen/Wilcoxon) + plantilla CSV
- reporte-rendimiento-academico y reporte-validacion-final (honestos: OE4 piloto S8 pendiente, OE5 dictamen pendiente)
- export .docx (instrumento OE4, RAGAS, ISO25010, matriz, reportes)
- .gitignore: excluye padrones xlsx + credenciales (PII)

Co-Authored-By: Claude Opus 4.8 (1M context) <noreply@anthropic.com>
</commit_message>
<xml_diff>
--- a/docs/matriz-trazabilidad-ISO25010.docx
+++ b/docs/matriz-trazabilidad-ISO25010.docx
@@ -2,32 +2,6 @@
 <file path=word/document.xml><?xml version="1.0" encoding="utf-8"?>
 <w:document xmlns:w="http://schemas.openxmlformats.org/wordprocessingml/2006/main" xmlns:m="http://schemas.openxmlformats.org/officeDocument/2006/math" xmlns:r="http://schemas.openxmlformats.org/officeDocument/2006/relationships" xmlns:o="urn:schemas-microsoft-com:office:office" xmlns:v="urn:schemas-microsoft-com:vml" xmlns:w10="urn:schemas-microsoft-com:office:word" xmlns:a="http://schemas.openxmlformats.org/drawingml/2006/main" xmlns:pic="http://schemas.openxmlformats.org/drawingml/2006/picture" xmlns:wp="http://schemas.openxmlformats.org/drawingml/2006/wordprocessingDrawing">
   <w:body>
-    <w:sdt>
-      <w:sdtPr>
-        <w:docPartObj>
-          <w:docPartGallery w:val="Table of Contents"/>
-          <w:docPartUnique/>
-        </w:docPartObj>
-      </w:sdtPr>
-      <w:sdtContent>
-        <w:p>
-          <w:pPr>
-            <w:pStyle w:val="TOCHeading"/>
-          </w:pPr>
-          <w:r>
-            <w:t xml:space="preserve">Table of Contents</w:t>
-          </w:r>
-        </w:p>
-        <w:p>
-          <w:r>
-            <w:fldChar w:fldCharType="begin" w:dirty="true"/>
-            <w:instrText xml:space="preserve">TOC \o "1-2" \h \z \u</w:instrText>
-            <w:fldChar w:fldCharType="separate"/>
-            <w:fldChar w:fldCharType="end"/>
-          </w:r>
-        </w:p>
-      </w:sdtContent>
-    </w:sdt>
     <w:bookmarkStart w:id="15" w:name="Xcf8b5b2f956cb5f19257c30ea0e29b65ebc5cd8"/>
     <w:p>
       <w:pPr>
@@ -4153,6 +4127,430 @@
             </w:pPr>
             <w:r>
               <w:t xml:space="preserve">⏳ (frontend Tasks 12-16)</w:t>
+            </w:r>
+          </w:p>
+        </w:tc>
+      </w:tr>
+      <w:tr>
+        <w:tc>
+          <w:tcPr/>
+          <w:p>
+            <w:pPr>
+              <w:pStyle w:val="Compact"/>
+            </w:pPr>
+            <w:r>
+              <w:rPr>
+                <w:b/>
+                <w:bCs/>
+              </w:rPr>
+              <w:t xml:space="preserve">RF-NEW-TUTOR-01</w:t>
+            </w:r>
+            <w:r>
+              <w:t xml:space="preserve"> </w:t>
+            </w:r>
+            <w:r>
+              <w:t xml:space="preserve">Acompañamiento proactivo del tutor (nudges contextuales)</w:t>
+            </w:r>
+          </w:p>
+        </w:tc>
+        <w:tc>
+          <w:tcPr/>
+          <w:p>
+            <w:pPr>
+              <w:pStyle w:val="Compact"/>
+            </w:pPr>
+            <w:r>
+              <w:t xml:space="preserve">Pertinencia funcional / Operabilidad</w:t>
+            </w:r>
+          </w:p>
+        </w:tc>
+        <w:tc>
+          <w:tcPr/>
+          <w:p>
+            <w:pPr>
+              <w:pStyle w:val="Compact"/>
+            </w:pPr>
+            <w:r>
+              <w:rPr>
+                <w:rStyle w:val="VerbatimChar"/>
+              </w:rPr>
+              <w:t xml:space="preserve">GET /tutor/nudges</w:t>
+            </w:r>
+            <w:r>
+              <w:t xml:space="preserve"> </w:t>
+            </w:r>
+            <w:r>
+              <w:t xml:space="preserve">(</w:t>
+            </w:r>
+            <w:r>
+              <w:rPr>
+                <w:rStyle w:val="VerbatimChar"/>
+              </w:rPr>
+              <w:t xml:space="preserve">routers/tutor.py</w:t>
+            </w:r>
+            <w:r>
+              <w:t xml:space="preserve"> </w:t>
+            </w:r>
+            <w:r>
+              <w:t xml:space="preserve">+</w:t>
+            </w:r>
+            <w:r>
+              <w:t xml:space="preserve"> </w:t>
+            </w:r>
+            <w:r>
+              <w:rPr>
+                <w:rStyle w:val="VerbatimChar"/>
+              </w:rPr>
+              <w:t xml:space="preserve">services/tutor_service.py</w:t>
+            </w:r>
+            <w:r>
+              <w:t xml:space="preserve">)</w:t>
+            </w:r>
+          </w:p>
+        </w:tc>
+        <w:tc>
+          <w:tcPr/>
+          <w:p>
+            <w:pPr>
+              <w:pStyle w:val="Compact"/>
+            </w:pPr>
+            <w:r>
+              <w:rPr>
+                <w:rStyle w:val="VerbatimChar"/>
+              </w:rPr>
+              <w:t xml:space="preserve">backend/tests/unit/test_tutor_service.py</w:t>
+            </w:r>
+            <w:r>
+              <w:t xml:space="preserve">,</w:t>
+            </w:r>
+            <w:r>
+              <w:t xml:space="preserve"> </w:t>
+            </w:r>
+            <w:r>
+              <w:rPr>
+                <w:rStyle w:val="VerbatimChar"/>
+              </w:rPr>
+              <w:t xml:space="preserve">backend/tests/integration/test_router_tutor.py</w:t>
+            </w:r>
+          </w:p>
+        </w:tc>
+        <w:tc>
+          <w:tcPr/>
+          <w:p>
+            <w:pPr>
+              <w:pStyle w:val="Compact"/>
+            </w:pPr>
+            <w:r>
+              <w:t xml:space="preserve">✅</w:t>
+            </w:r>
+          </w:p>
+        </w:tc>
+      </w:tr>
+      <w:tr>
+        <w:tc>
+          <w:tcPr/>
+          <w:p>
+            <w:pPr>
+              <w:pStyle w:val="Compact"/>
+            </w:pPr>
+            <w:r>
+              <w:rPr>
+                <w:b/>
+                <w:bCs/>
+              </w:rPr>
+              <w:t xml:space="preserve">RF-NEW-TUTOR-02</w:t>
+            </w:r>
+            <w:r>
+              <w:t xml:space="preserve"> </w:t>
+            </w:r>
+            <w:r>
+              <w:t xml:space="preserve">Asistente flotante del tutor (chat RAG omnipresente)</w:t>
+            </w:r>
+          </w:p>
+        </w:tc>
+        <w:tc>
+          <w:tcPr/>
+          <w:p>
+            <w:pPr>
+              <w:pStyle w:val="Compact"/>
+            </w:pPr>
+            <w:r>
+              <w:t xml:space="preserve">Operabilidad / Pertinencia funcional</w:t>
+            </w:r>
+          </w:p>
+        </w:tc>
+        <w:tc>
+          <w:tcPr/>
+          <w:p>
+            <w:pPr>
+              <w:pStyle w:val="Compact"/>
+            </w:pPr>
+            <w:r>
+              <w:rPr>
+                <w:rStyle w:val="VerbatimChar"/>
+              </w:rPr>
+              <w:t xml:space="preserve">/chat</w:t>
+            </w:r>
+            <w:r>
+              <w:t xml:space="preserve"> </w:t>
+            </w:r>
+            <w:r>
+              <w:t xml:space="preserve">(reusado) ·</w:t>
+            </w:r>
+            <w:r>
+              <w:t xml:space="preserve"> </w:t>
+            </w:r>
+            <w:r>
+              <w:rPr>
+                <w:rStyle w:val="VerbatimChar"/>
+              </w:rPr>
+              <w:t xml:space="preserve">components/tutor/FloatingTutor.tsx</w:t>
+            </w:r>
+          </w:p>
+        </w:tc>
+        <w:tc>
+          <w:tcPr/>
+          <w:p>
+            <w:pPr>
+              <w:pStyle w:val="Compact"/>
+            </w:pPr>
+            <w:r>
+              <w:rPr>
+                <w:rStyle w:val="VerbatimChar"/>
+              </w:rPr>
+              <w:t xml:space="preserve">frontend/src/components/tutor/FloatingTutor.test.tsx</w:t>
+            </w:r>
+            <w:r>
+              <w:t xml:space="preserve"> </w:t>
+            </w:r>
+            <w:r>
+              <w:t xml:space="preserve">+ cobertura backend</w:t>
+            </w:r>
+            <w:r>
+              <w:t xml:space="preserve"> </w:t>
+            </w:r>
+            <w:r>
+              <w:rPr>
+                <w:rStyle w:val="VerbatimChar"/>
+              </w:rPr>
+              <w:t xml:space="preserve">/chat</w:t>
+            </w:r>
+            <w:r>
+              <w:t xml:space="preserve"> </w:t>
+            </w:r>
+            <w:r>
+              <w:t xml:space="preserve">existente</w:t>
+            </w:r>
+          </w:p>
+        </w:tc>
+        <w:tc>
+          <w:tcPr/>
+          <w:p>
+            <w:pPr>
+              <w:pStyle w:val="Compact"/>
+            </w:pPr>
+            <w:r>
+              <w:t xml:space="preserve">implementado</w:t>
+            </w:r>
+          </w:p>
+        </w:tc>
+      </w:tr>
+      <w:tr>
+        <w:tc>
+          <w:tcPr/>
+          <w:p>
+            <w:pPr>
+              <w:pStyle w:val="Compact"/>
+            </w:pPr>
+            <w:r>
+              <w:rPr>
+                <w:b/>
+                <w:bCs/>
+              </w:rPr>
+              <w:t xml:space="preserve">RF-NEW-TUTOR-03</w:t>
+            </w:r>
+            <w:r>
+              <w:t xml:space="preserve"> </w:t>
+            </w:r>
+            <w:r>
+              <w:t xml:space="preserve">Banco de recursos de aprendizaje curados (videos/libros)</w:t>
+            </w:r>
+          </w:p>
+        </w:tc>
+        <w:tc>
+          <w:tcPr/>
+          <w:p>
+            <w:pPr>
+              <w:pStyle w:val="Compact"/>
+            </w:pPr>
+            <w:r>
+              <w:t xml:space="preserve">Pertinencia funcional / Operabilidad</w:t>
+            </w:r>
+          </w:p>
+        </w:tc>
+        <w:tc>
+          <w:tcPr/>
+          <w:p>
+            <w:pPr>
+              <w:pStyle w:val="Compact"/>
+            </w:pPr>
+            <w:r>
+              <w:rPr>
+                <w:rStyle w:val="VerbatimChar"/>
+              </w:rPr>
+              <w:t xml:space="preserve">/resources + /admin/resources</w:t>
+            </w:r>
+            <w:r>
+              <w:t xml:space="preserve"> </w:t>
+            </w:r>
+            <w:r>
+              <w:t xml:space="preserve">·</w:t>
+            </w:r>
+            <w:r>
+              <w:t xml:space="preserve"> </w:t>
+            </w:r>
+            <w:r>
+              <w:rPr>
+                <w:rStyle w:val="VerbatimChar"/>
+              </w:rPr>
+              <w:t xml:space="preserve">components/resources/*</w:t>
+            </w:r>
+          </w:p>
+        </w:tc>
+        <w:tc>
+          <w:tcPr/>
+          <w:p>
+            <w:pPr>
+              <w:pStyle w:val="Compact"/>
+            </w:pPr>
+            <w:r>
+              <w:rPr>
+                <w:rStyle w:val="VerbatimChar"/>
+              </w:rPr>
+              <w:t xml:space="preserve">test_router_resources.py + test_router_admin_resources.py + ResourceCard.test.tsx</w:t>
+            </w:r>
+          </w:p>
+        </w:tc>
+        <w:tc>
+          <w:tcPr/>
+          <w:p>
+            <w:pPr>
+              <w:pStyle w:val="Compact"/>
+            </w:pPr>
+            <w:r>
+              <w:t xml:space="preserve">implementado</w:t>
+            </w:r>
+          </w:p>
+        </w:tc>
+      </w:tr>
+      <w:tr>
+        <w:tc>
+          <w:tcPr/>
+          <w:p>
+            <w:pPr>
+              <w:pStyle w:val="Compact"/>
+            </w:pPr>
+            <w:r>
+              <w:rPr>
+                <w:b/>
+                <w:bCs/>
+              </w:rPr>
+              <w:t xml:space="preserve">RF-NEW-TUTOR-04</w:t>
+            </w:r>
+            <w:r>
+              <w:t xml:space="preserve"> </w:t>
+            </w:r>
+            <w:r>
+              <w:t xml:space="preserve">Refuerzo del tutor en resultados de evaluación (quiz/coding/entrada)</w:t>
+            </w:r>
+          </w:p>
+        </w:tc>
+        <w:tc>
+          <w:tcPr/>
+          <w:p>
+            <w:pPr>
+              <w:pStyle w:val="Compact"/>
+            </w:pPr>
+            <w:r>
+              <w:t xml:space="preserve">Pertinencia funcional / Operabilidad</w:t>
+            </w:r>
+          </w:p>
+        </w:tc>
+        <w:tc>
+          <w:tcPr/>
+          <w:p>
+            <w:pPr>
+              <w:pStyle w:val="Compact"/>
+            </w:pPr>
+            <w:r>
+              <w:rPr>
+                <w:rStyle w:val="VerbatimChar"/>
+              </w:rPr>
+              <w:t xml:space="preserve">tutor_service._result_nudges</w:t>
+            </w:r>
+            <w:r>
+              <w:t xml:space="preserve"> </w:t>
+            </w:r>
+            <w:r>
+              <w:t xml:space="preserve">· montajes en QuizPage/CodingChallengePage/EntryAssessmentPage</w:t>
+            </w:r>
+          </w:p>
+        </w:tc>
+        <w:tc>
+          <w:tcPr/>
+          <w:p>
+            <w:pPr>
+              <w:pStyle w:val="Compact"/>
+            </w:pPr>
+            <w:r>
+              <w:rPr>
+                <w:rStyle w:val="VerbatimChar"/>
+              </w:rPr>
+              <w:t xml:space="preserve">test_tutor_service.py</w:t>
+            </w:r>
+            <w:r>
+              <w:t xml:space="preserve"> </w:t>
+            </w:r>
+            <w:r>
+              <w:t xml:space="preserve">(bandas de resultado) +</w:t>
+            </w:r>
+            <w:r>
+              <w:t xml:space="preserve"> </w:t>
+            </w:r>
+            <w:r>
+              <w:rPr>
+                <w:rStyle w:val="VerbatimChar"/>
+              </w:rPr>
+              <w:t xml:space="preserve">test_router_tutor.py</w:t>
+            </w:r>
+            <w:r>
+              <w:t xml:space="preserve"> </w:t>
+            </w:r>
+            <w:r>
+              <w:t xml:space="preserve">(corte de BD en contextos</w:t>
+            </w:r>
+            <w:r>
+              <w:t xml:space="preserve"> </w:t>
+            </w:r>
+            <w:r>
+              <w:rPr>
+                <w:rStyle w:val="VerbatimChar"/>
+              </w:rPr>
+              <w:t xml:space="preserve">*_result</w:t>
+            </w:r>
+            <w:r>
+              <w:t xml:space="preserve">)</w:t>
+            </w:r>
+          </w:p>
+        </w:tc>
+        <w:tc>
+          <w:tcPr/>
+          <w:p>
+            <w:pPr>
+              <w:pStyle w:val="Compact"/>
+            </w:pPr>
+            <w:r>
+              <w:t xml:space="preserve">implementado</w:t>
             </w:r>
           </w:p>
         </w:tc>

</xml_diff>